<commit_message>
refactor: export the My Voice and Research Project packs as composable children
Both generators built docx Documents directly, so their content could only be
consumed as a finished file. Split each builder into a children array plus a
thin document wrapper, and export the children (facilitatorPlanChildren,
workbookChildren, cardsChildren, rubricChildren) so the Educator Guide can
embed exactly this content instead of re-authoring it.

The facilitator plans take an `embedded` option that drops their cover block
and closing "offline pack" note, which the guide supplies itself. Both scripts
stay runnable on their own, now guarded by require.main === module.

Also carries the shared plain() markdown strip and a page-numbered footer —
these plans are long enough to be printed and paged through.

Co-Authored-By: Claude Opus 5 <noreply@anthropic.com>
</commit_message>
<xml_diff>
--- a/public/downloads/my-voice-facilitator-unit-plan.docx
+++ b/public/downloads/my-voice-facilitator-unit-plan.docx
@@ -54,7 +54,7 @@
           <w:sz w:val="22"/>
           <w:szCs w:val="22"/>
         </w:rPr>
-        <w:t xml:space="preserve">The full 50-hour plan for delivering My Voice — the optional English Language Development component — fully offline in the Cox's Bazar camps, as an oral and visual first, emergent-literacy course for a largely pre-literate cohort. It is set out in hours, not weeks, so you can fit it into your own timetable over a minimum of 10 weeks. Learners begin from their own name and voice: hearing and making the sounds of English, meeting the alphabet, gathering the words and simple spoken sentences to say who they are, and making and sharing a "My Name, My Voice" card. Times are deliberately generous, because oral and visual delivery with drawing and translation, from a beginning with no reading, takes longer than it first appears.</w:t>
+        <w:t xml:space="preserve">The full 50-hour plan for delivering My Voice — the English Language Development component, compulsory in this edition — fully offline in the Cox's Bazar camps, as an oral and visual first, emergent-literacy course for a largely pre-literate cohort. It is set out in hours, not weeks, so you can fit it into your own timetable over a minimum of 10 weeks. Learners begin from their own name and voice: hearing and making the sounds of English, meeting the alphabet, gathering the words and simple spoken sentences to say who they are, and making and sharing a "My Name, My Voice" card. Times are deliberately generous, because oral and visual delivery with drawing and translation, from a beginning with no reading, takes longer than it first appears.</w:t>
       </w:r>
     </w:p>
     <w:p>
@@ -141,7 +141,7 @@
           <w:sz w:val="22"/>
           <w:szCs w:val="22"/>
         </w:rPr>
-        <w:t xml:space="preserve">English Language Development is an optional component and is not one of the two competencies formally graded on Learning Bridge+ (those, Set and Pursue Goals and Investigate Real World Issues, live in the Agency in Learning and Research Project components). Assess English progress formatively, against the A1- Can-Do outcomes of the My Voice course and each learner's own growth, to inform the readiness picture and the support a learner needs — not as a pass/fail gate. Gather evidence from across the whole component, not a single test: the growing My Voice book, the sounds and words a learner can hear and say, their spoken self-introduction, and the "My Name, My Voice" card and sharing. Judge against where each learner began: for someone who arrived with no reading, saying a short true introduction in English and recognising and writing their own name is strong evidence of progress. The learner's own "I can..." self-check, marked at the start and revisited at the end, is the anchor for recognising and naming that growth. This work also generates self-awareness (FUS1) evidence that can feed the wider readiness judgement. Do not over-assess: what learners can do, gathered warmly over time, tells you more than a moment of testing that a beginner may find frightening.</w:t>
+        <w:t xml:space="preserve">English Language Development is a compulsory component in this edition, but it is not one of the two competencies formally graded on Learning Bridge+ (those, Set and Pursue Goals and Investigate Real World Issues, live in the Agency in Learning and Research Project components). Assess English progress formatively, against the A1- Can-Do outcomes of the My Voice course and each learner's own growth, to inform the readiness picture and the support a learner needs — not as a pass/fail gate. Gather evidence from across the whole component, not a single test: the growing My Voice book, the sounds and words a learner can hear and say, their spoken self-introduction, and the "My Name, My Voice" card and sharing. Judge against where each learner began: for someone who arrived with no reading, saying a short true introduction in English and recognising and writing their own name is strong evidence of progress. The learner's own "I can..." self-check, marked at the start and revisited at the end, is the anchor for recognising and naming that growth. This work also generates self-awareness (FUS1) evidence that can feed the wider readiness judgement. Do not over-assess: what learners can do, gathered warmly over time, tells you more than a moment of testing that a beginner may find frightening.</w:t>
       </w:r>
     </w:p>
     <w:p>
@@ -16402,6 +16402,7 @@
       </w:r>
     </w:p>
     <w:sectPr>
+      <w:footerReference w:type="default" r:id="rId7"/>
       <w:pgSz w:w="12240" w:h="15840" w:orient="portrait"/>
       <w:pgMar w:top="1440" w:right="1440" w:bottom="1440" w:left="1440" w:header="708" w:footer="708" w:gutter="0"/>
       <w:pgNumType/>
@@ -16450,6 +16451,35 @@
     </w:p>
   </w:endnote>
 </w:endnotes>
+</file>
+
+<file path=word/footer1.xml><?xml version="1.0" encoding="utf-8"?>
+<w:ftr xmlns:wpc="http://schemas.microsoft.com/office/word/2010/wordprocessingCanvas" xmlns:mc="http://schemas.openxmlformats.org/markup-compatibility/2006" xmlns:o="urn:schemas-microsoft-com:office:office" xmlns:r="http://schemas.openxmlformats.org/officeDocument/2006/relationships" xmlns:m="http://schemas.openxmlformats.org/officeDocument/2006/math" xmlns:v="urn:schemas-microsoft-com:vml" xmlns:wp14="http://schemas.microsoft.com/office/word/2010/wordprocessingDrawing" xmlns:wp="http://schemas.openxmlformats.org/drawingml/2006/wordprocessingDrawing" xmlns:w10="urn:schemas-microsoft-com:office:word" xmlns:w="http://schemas.openxmlformats.org/wordprocessingml/2006/main" xmlns:w14="http://schemas.microsoft.com/office/word/2010/wordml" xmlns:w15="http://schemas.microsoft.com/office/word/2012/wordml" xmlns:wpg="http://schemas.microsoft.com/office/word/2010/wordprocessingGroup" xmlns:wpi="http://schemas.microsoft.com/office/word/2010/wordprocessingInk" xmlns:wne="http://schemas.microsoft.com/office/word/2006/wordml" xmlns:wps="http://schemas.microsoft.com/office/word/2010/wordprocessingShape">
+  <w:p>
+    <w:pPr>
+      <w:jc w:val="right"/>
+    </w:pPr>
+    <w:r>
+      <w:rPr>
+        <w:color w:val="5A6473"/>
+        <w:sz w:val="16"/>
+        <w:szCs w:val="16"/>
+      </w:rPr>
+      <w:t xml:space="preserve">My Voice  ·  Learning Bridge+ (Cox's Bazar)    </w:t>
+    </w:r>
+    <w:r>
+      <w:rPr>
+        <w:color w:val="5A6473"/>
+        <w:sz w:val="16"/>
+        <w:szCs w:val="16"/>
+      </w:rPr>
+      <w:fldChar w:fldCharType="begin"/>
+      <w:instrText xml:space="preserve">PAGE</w:instrText>
+      <w:fldChar w:fldCharType="separate"/>
+      <w:fldChar w:fldCharType="end"/>
+    </w:r>
+  </w:p>
+</w:ftr>
 </file>
 
 <file path=word/footnotes.xml><?xml version="1.0" encoding="utf-8"?>

</xml_diff>